<commit_message>
Update Laboratorio .NET - Grupo 2.docx
</commit_message>
<xml_diff>
--- a/Laboratorio .NET - Grupo 2.docx
+++ b/Laboratorio .NET - Grupo 2.docx
@@ -248,7 +248,7 @@
           <w:r>
             <w:fldChar w:fldCharType="separate"/>
           </w:r>
-          <w:hyperlink w:anchor="_Toc244112970" w:history="1">
+          <w:hyperlink w:anchor="_Toc244165283" w:history="1">
             <w:r>
               <w:rPr>
                 <w:rStyle w:val="Hipervnculo"/>
@@ -272,7 +272,7 @@
               <w:rPr>
                 <w:noProof/>
               </w:rPr>
-              <w:instrText xml:space="preserve"> PAGEREF _Toc244112970 \h </w:instrText>
+              <w:instrText xml:space="preserve"> PAGEREF _Toc244165283 \h </w:instrText>
             </w:r>
             <w:r>
               <w:rPr>
@@ -312,7 +312,7 @@
               <w:szCs w:val="22"/>
             </w:rPr>
           </w:pPr>
-          <w:hyperlink w:anchor="_Toc244112971" w:history="1">
+          <w:hyperlink w:anchor="_Toc244165284" w:history="1">
             <w:r>
               <w:rPr>
                 <w:rStyle w:val="Hipervnculo"/>
@@ -336,7 +336,7 @@
               <w:rPr>
                 <w:noProof/>
               </w:rPr>
-              <w:instrText xml:space="preserve"> PAGEREF _Toc244112971 \h </w:instrText>
+              <w:instrText xml:space="preserve"> PAGEREF _Toc244165284 \h </w:instrText>
             </w:r>
             <w:r>
               <w:rPr>
@@ -376,7 +376,7 @@
               <w:szCs w:val="22"/>
             </w:rPr>
           </w:pPr>
-          <w:hyperlink w:anchor="_Toc244112972" w:history="1">
+          <w:hyperlink w:anchor="_Toc244165285" w:history="1">
             <w:r>
               <w:rPr>
                 <w:rStyle w:val="Hipervnculo"/>
@@ -400,7 +400,7 @@
               <w:rPr>
                 <w:noProof/>
               </w:rPr>
-              <w:instrText xml:space="preserve"> PAGEREF _Toc244112972 \h </w:instrText>
+              <w:instrText xml:space="preserve"> PAGEREF _Toc244165285 \h </w:instrText>
             </w:r>
             <w:r>
               <w:rPr>
@@ -440,7 +440,7 @@
               <w:szCs w:val="22"/>
             </w:rPr>
           </w:pPr>
-          <w:hyperlink w:anchor="_Toc244112973" w:history="1">
+          <w:hyperlink w:anchor="_Toc244165286" w:history="1">
             <w:r>
               <w:rPr>
                 <w:rStyle w:val="Hipervnculo"/>
@@ -464,7 +464,7 @@
               <w:rPr>
                 <w:noProof/>
               </w:rPr>
-              <w:instrText xml:space="preserve"> PAGEREF _Toc244112973 \h </w:instrText>
+              <w:instrText xml:space="preserve"> PAGEREF _Toc244165286 \h </w:instrText>
             </w:r>
             <w:r>
               <w:rPr>
@@ -504,7 +504,7 @@
               <w:szCs w:val="22"/>
             </w:rPr>
           </w:pPr>
-          <w:hyperlink w:anchor="_Toc244112974" w:history="1">
+          <w:hyperlink w:anchor="_Toc244165287" w:history="1">
             <w:r>
               <w:rPr>
                 <w:rStyle w:val="Hipervnculo"/>
@@ -528,7 +528,7 @@
               <w:rPr>
                 <w:noProof/>
               </w:rPr>
-              <w:instrText xml:space="preserve"> PAGEREF _Toc244112974 \h </w:instrText>
+              <w:instrText xml:space="preserve"> PAGEREF _Toc244165287 \h </w:instrText>
             </w:r>
             <w:r>
               <w:rPr>
@@ -568,7 +568,7 @@
               <w:szCs w:val="22"/>
             </w:rPr>
           </w:pPr>
-          <w:hyperlink w:anchor="_Toc244112975" w:history="1">
+          <w:hyperlink w:anchor="_Toc244165288" w:history="1">
             <w:r>
               <w:rPr>
                 <w:rStyle w:val="Hipervnculo"/>
@@ -592,7 +592,7 @@
               <w:rPr>
                 <w:noProof/>
               </w:rPr>
-              <w:instrText xml:space="preserve"> PAGEREF _Toc244112975 \h </w:instrText>
+              <w:instrText xml:space="preserve"> PAGEREF _Toc244165288 \h </w:instrText>
             </w:r>
             <w:r>
               <w:rPr>
@@ -632,7 +632,7 @@
               <w:szCs w:val="22"/>
             </w:rPr>
           </w:pPr>
-          <w:hyperlink w:anchor="_Toc244112976" w:history="1">
+          <w:hyperlink w:anchor="_Toc244165289" w:history="1">
             <w:r>
               <w:rPr>
                 <w:rStyle w:val="Hipervnculo"/>
@@ -656,7 +656,7 @@
               <w:rPr>
                 <w:noProof/>
               </w:rPr>
-              <w:instrText xml:space="preserve"> PAGEREF _Toc244112976 \h </w:instrText>
+              <w:instrText xml:space="preserve"> PAGEREF _Toc244165289 \h </w:instrText>
             </w:r>
             <w:r>
               <w:rPr>
@@ -696,7 +696,7 @@
               <w:szCs w:val="22"/>
             </w:rPr>
           </w:pPr>
-          <w:hyperlink w:anchor="_Toc244112977" w:history="1">
+          <w:hyperlink w:anchor="_Toc244165290" w:history="1">
             <w:r>
               <w:rPr>
                 <w:rStyle w:val="Hipervnculo"/>
@@ -720,7 +720,7 @@
               <w:rPr>
                 <w:noProof/>
               </w:rPr>
-              <w:instrText xml:space="preserve"> PAGEREF _Toc244112977 \h </w:instrText>
+              <w:instrText xml:space="preserve"> PAGEREF _Toc244165290 \h </w:instrText>
             </w:r>
             <w:r>
               <w:rPr>
@@ -760,7 +760,7 @@
               <w:szCs w:val="22"/>
             </w:rPr>
           </w:pPr>
-          <w:hyperlink w:anchor="_Toc244112978" w:history="1">
+          <w:hyperlink w:anchor="_Toc244165291" w:history="1">
             <w:r>
               <w:rPr>
                 <w:rStyle w:val="Hipervnculo"/>
@@ -784,7 +784,7 @@
               <w:rPr>
                 <w:noProof/>
               </w:rPr>
-              <w:instrText xml:space="preserve"> PAGEREF _Toc244112978 \h </w:instrText>
+              <w:instrText xml:space="preserve"> PAGEREF _Toc244165291 \h </w:instrText>
             </w:r>
             <w:r>
               <w:rPr>
@@ -824,7 +824,7 @@
               <w:szCs w:val="22"/>
             </w:rPr>
           </w:pPr>
-          <w:hyperlink w:anchor="_Toc244112979" w:history="1">
+          <w:hyperlink w:anchor="_Toc244165292" w:history="1">
             <w:r>
               <w:rPr>
                 <w:rStyle w:val="Hipervnculo"/>
@@ -848,7 +848,7 @@
               <w:rPr>
                 <w:noProof/>
               </w:rPr>
-              <w:instrText xml:space="preserve"> PAGEREF _Toc244112979 \h </w:instrText>
+              <w:instrText xml:space="preserve"> PAGEREF _Toc244165292 \h </w:instrText>
             </w:r>
             <w:r>
               <w:rPr>
@@ -888,7 +888,7 @@
               <w:szCs w:val="22"/>
             </w:rPr>
           </w:pPr>
-          <w:hyperlink w:anchor="_Toc244112980" w:history="1">
+          <w:hyperlink w:anchor="_Toc244165293" w:history="1">
             <w:r>
               <w:rPr>
                 <w:rStyle w:val="Hipervnculo"/>
@@ -912,7 +912,7 @@
               <w:rPr>
                 <w:noProof/>
               </w:rPr>
-              <w:instrText xml:space="preserve"> PAGEREF _Toc244112980 \h </w:instrText>
+              <w:instrText xml:space="preserve"> PAGEREF _Toc244165293 \h </w:instrText>
             </w:r>
             <w:r>
               <w:rPr>
@@ -952,7 +952,7 @@
               <w:szCs w:val="22"/>
             </w:rPr>
           </w:pPr>
-          <w:hyperlink w:anchor="_Toc244112981" w:history="1">
+          <w:hyperlink w:anchor="_Toc244165294" w:history="1">
             <w:r>
               <w:rPr>
                 <w:rStyle w:val="Hipervnculo"/>
@@ -976,7 +976,7 @@
               <w:rPr>
                 <w:noProof/>
               </w:rPr>
-              <w:instrText xml:space="preserve"> PAGEREF _Toc244112981 \h </w:instrText>
+              <w:instrText xml:space="preserve"> PAGEREF _Toc244165294 \h </w:instrText>
             </w:r>
             <w:r>
               <w:rPr>
@@ -1016,7 +1016,7 @@
               <w:szCs w:val="22"/>
             </w:rPr>
           </w:pPr>
-          <w:hyperlink w:anchor="_Toc244112982" w:history="1">
+          <w:hyperlink w:anchor="_Toc244165295" w:history="1">
             <w:r>
               <w:rPr>
                 <w:rStyle w:val="Hipervnculo"/>
@@ -1040,7 +1040,7 @@
               <w:rPr>
                 <w:noProof/>
               </w:rPr>
-              <w:instrText xml:space="preserve"> PAGEREF _Toc244112982 \h </w:instrText>
+              <w:instrText xml:space="preserve"> PAGEREF _Toc244165295 \h </w:instrText>
             </w:r>
             <w:r>
               <w:rPr>
@@ -1080,7 +1080,7 @@
               <w:szCs w:val="22"/>
             </w:rPr>
           </w:pPr>
-          <w:hyperlink w:anchor="_Toc244112983" w:history="1">
+          <w:hyperlink w:anchor="_Toc244165296" w:history="1">
             <w:r>
               <w:rPr>
                 <w:rStyle w:val="Hipervnculo"/>
@@ -1104,7 +1104,7 @@
               <w:rPr>
                 <w:noProof/>
               </w:rPr>
-              <w:instrText xml:space="preserve"> PAGEREF _Toc244112983 \h </w:instrText>
+              <w:instrText xml:space="preserve"> PAGEREF _Toc244165296 \h </w:instrText>
             </w:r>
             <w:r>
               <w:rPr>
@@ -1144,7 +1144,7 @@
               <w:szCs w:val="22"/>
             </w:rPr>
           </w:pPr>
-          <w:hyperlink w:anchor="_Toc244112984" w:history="1">
+          <w:hyperlink w:anchor="_Toc244165297" w:history="1">
             <w:r>
               <w:rPr>
                 <w:rStyle w:val="Hipervnculo"/>
@@ -1168,7 +1168,7 @@
               <w:rPr>
                 <w:noProof/>
               </w:rPr>
-              <w:instrText xml:space="preserve"> PAGEREF _Toc244112984 \h </w:instrText>
+              <w:instrText xml:space="preserve"> PAGEREF _Toc244165297 \h </w:instrText>
             </w:r>
             <w:r>
               <w:rPr>
@@ -1208,7 +1208,7 @@
               <w:szCs w:val="22"/>
             </w:rPr>
           </w:pPr>
-          <w:hyperlink w:anchor="_Toc244112985" w:history="1">
+          <w:hyperlink w:anchor="_Toc244165298" w:history="1">
             <w:r>
               <w:rPr>
                 <w:rStyle w:val="Hipervnculo"/>
@@ -1232,7 +1232,7 @@
               <w:rPr>
                 <w:noProof/>
               </w:rPr>
-              <w:instrText xml:space="preserve"> PAGEREF _Toc244112985 \h </w:instrText>
+              <w:instrText xml:space="preserve"> PAGEREF _Toc244165298 \h </w:instrText>
             </w:r>
             <w:r>
               <w:rPr>
@@ -1272,7 +1272,7 @@
               <w:szCs w:val="22"/>
             </w:rPr>
           </w:pPr>
-          <w:hyperlink w:anchor="_Toc244112986" w:history="1">
+          <w:hyperlink w:anchor="_Toc244165299" w:history="1">
             <w:r>
               <w:rPr>
                 <w:rStyle w:val="Hipervnculo"/>
@@ -1296,7 +1296,7 @@
               <w:rPr>
                 <w:noProof/>
               </w:rPr>
-              <w:instrText xml:space="preserve"> PAGEREF _Toc244112986 \h </w:instrText>
+              <w:instrText xml:space="preserve"> PAGEREF _Toc244165299 \h </w:instrText>
             </w:r>
             <w:r>
               <w:rPr>
@@ -1336,7 +1336,7 @@
               <w:szCs w:val="22"/>
             </w:rPr>
           </w:pPr>
-          <w:hyperlink w:anchor="_Toc244112987" w:history="1">
+          <w:hyperlink w:anchor="_Toc244165300" w:history="1">
             <w:r>
               <w:rPr>
                 <w:rStyle w:val="Hipervnculo"/>
@@ -1360,7 +1360,7 @@
               <w:rPr>
                 <w:noProof/>
               </w:rPr>
-              <w:instrText xml:space="preserve"> PAGEREF _Toc244112987 \h </w:instrText>
+              <w:instrText xml:space="preserve"> PAGEREF _Toc244165300 \h </w:instrText>
             </w:r>
             <w:r>
               <w:rPr>
@@ -1400,7 +1400,7 @@
               <w:szCs w:val="22"/>
             </w:rPr>
           </w:pPr>
-          <w:hyperlink w:anchor="_Toc244112988" w:history="1">
+          <w:hyperlink w:anchor="_Toc244165301" w:history="1">
             <w:r>
               <w:rPr>
                 <w:rStyle w:val="Hipervnculo"/>
@@ -1424,7 +1424,7 @@
               <w:rPr>
                 <w:noProof/>
               </w:rPr>
-              <w:instrText xml:space="preserve"> PAGEREF _Toc244112988 \h </w:instrText>
+              <w:instrText xml:space="preserve"> PAGEREF _Toc244165301 \h </w:instrText>
             </w:r>
             <w:r>
               <w:rPr>
@@ -1464,7 +1464,7 @@
               <w:szCs w:val="22"/>
             </w:rPr>
           </w:pPr>
-          <w:hyperlink w:anchor="_Toc244112989" w:history="1">
+          <w:hyperlink w:anchor="_Toc244165302" w:history="1">
             <w:r>
               <w:rPr>
                 <w:rStyle w:val="Hipervnculo"/>
@@ -1488,7 +1488,7 @@
               <w:rPr>
                 <w:noProof/>
               </w:rPr>
-              <w:instrText xml:space="preserve"> PAGEREF _Toc244112989 \h </w:instrText>
+              <w:instrText xml:space="preserve"> PAGEREF _Toc244165302 \h </w:instrText>
             </w:r>
             <w:r>
               <w:rPr>
@@ -1528,7 +1528,7 @@
               <w:szCs w:val="22"/>
             </w:rPr>
           </w:pPr>
-          <w:hyperlink w:anchor="_Toc244112990" w:history="1">
+          <w:hyperlink w:anchor="_Toc244165303" w:history="1">
             <w:r>
               <w:rPr>
                 <w:rStyle w:val="Hipervnculo"/>
@@ -1552,7 +1552,7 @@
               <w:rPr>
                 <w:noProof/>
               </w:rPr>
-              <w:instrText xml:space="preserve"> PAGEREF _Toc244112990 \h </w:instrText>
+              <w:instrText xml:space="preserve"> PAGEREF _Toc244165303 \h </w:instrText>
             </w:r>
             <w:r>
               <w:rPr>
@@ -1592,7 +1592,7 @@
               <w:szCs w:val="22"/>
             </w:rPr>
           </w:pPr>
-          <w:hyperlink w:anchor="_Toc244112991" w:history="1">
+          <w:hyperlink w:anchor="_Toc244165304" w:history="1">
             <w:r>
               <w:rPr>
                 <w:rStyle w:val="Hipervnculo"/>
@@ -1616,7 +1616,7 @@
               <w:rPr>
                 <w:noProof/>
               </w:rPr>
-              <w:instrText xml:space="preserve"> PAGEREF _Toc244112991 \h </w:instrText>
+              <w:instrText xml:space="preserve"> PAGEREF _Toc244165304 \h </w:instrText>
             </w:r>
             <w:r>
               <w:rPr>
@@ -1656,7 +1656,7 @@
               <w:szCs w:val="22"/>
             </w:rPr>
           </w:pPr>
-          <w:hyperlink w:anchor="_Toc244112992" w:history="1">
+          <w:hyperlink w:anchor="_Toc244165305" w:history="1">
             <w:r>
               <w:rPr>
                 <w:rStyle w:val="Hipervnculo"/>
@@ -1680,7 +1680,7 @@
               <w:rPr>
                 <w:noProof/>
               </w:rPr>
-              <w:instrText xml:space="preserve"> PAGEREF _Toc244112992 \h </w:instrText>
+              <w:instrText xml:space="preserve"> PAGEREF _Toc244165305 \h </w:instrText>
             </w:r>
             <w:r>
               <w:rPr>
@@ -1720,7 +1720,7 @@
               <w:szCs w:val="22"/>
             </w:rPr>
           </w:pPr>
-          <w:hyperlink w:anchor="_Toc244112993" w:history="1">
+          <w:hyperlink w:anchor="_Toc244165306" w:history="1">
             <w:r>
               <w:rPr>
                 <w:rStyle w:val="Hipervnculo"/>
@@ -1744,7 +1744,7 @@
               <w:rPr>
                 <w:noProof/>
               </w:rPr>
-              <w:instrText xml:space="preserve"> PAGEREF _Toc244112993 \h </w:instrText>
+              <w:instrText xml:space="preserve"> PAGEREF _Toc244165306 \h </w:instrText>
             </w:r>
             <w:r>
               <w:rPr>
@@ -1784,7 +1784,7 @@
               <w:szCs w:val="22"/>
             </w:rPr>
           </w:pPr>
-          <w:hyperlink w:anchor="_Toc244112994" w:history="1">
+          <w:hyperlink w:anchor="_Toc244165307" w:history="1">
             <w:r>
               <w:rPr>
                 <w:rStyle w:val="Hipervnculo"/>
@@ -1808,7 +1808,7 @@
               <w:rPr>
                 <w:noProof/>
               </w:rPr>
-              <w:instrText xml:space="preserve"> PAGEREF _Toc244112994 \h </w:instrText>
+              <w:instrText xml:space="preserve"> PAGEREF _Toc244165307 \h </w:instrText>
             </w:r>
             <w:r>
               <w:rPr>
@@ -1848,7 +1848,7 @@
               <w:szCs w:val="22"/>
             </w:rPr>
           </w:pPr>
-          <w:hyperlink w:anchor="_Toc244112995" w:history="1">
+          <w:hyperlink w:anchor="_Toc244165308" w:history="1">
             <w:r>
               <w:rPr>
                 <w:rStyle w:val="Hipervnculo"/>
@@ -1872,7 +1872,7 @@
               <w:rPr>
                 <w:noProof/>
               </w:rPr>
-              <w:instrText xml:space="preserve"> PAGEREF _Toc244112995 \h </w:instrText>
+              <w:instrText xml:space="preserve"> PAGEREF _Toc244165308 \h </w:instrText>
             </w:r>
             <w:r>
               <w:rPr>
@@ -1912,7 +1912,7 @@
               <w:szCs w:val="22"/>
             </w:rPr>
           </w:pPr>
-          <w:hyperlink w:anchor="_Toc244112996" w:history="1">
+          <w:hyperlink w:anchor="_Toc244165309" w:history="1">
             <w:r>
               <w:rPr>
                 <w:rStyle w:val="Hipervnculo"/>
@@ -1936,7 +1936,7 @@
               <w:rPr>
                 <w:noProof/>
               </w:rPr>
-              <w:instrText xml:space="preserve"> PAGEREF _Toc244112996 \h </w:instrText>
+              <w:instrText xml:space="preserve"> PAGEREF _Toc244165309 \h </w:instrText>
             </w:r>
             <w:r>
               <w:rPr>
@@ -1976,7 +1976,7 @@
               <w:szCs w:val="22"/>
             </w:rPr>
           </w:pPr>
-          <w:hyperlink w:anchor="_Toc244112997" w:history="1">
+          <w:hyperlink w:anchor="_Toc244165310" w:history="1">
             <w:r>
               <w:rPr>
                 <w:rStyle w:val="Hipervnculo"/>
@@ -2000,7 +2000,7 @@
               <w:rPr>
                 <w:noProof/>
               </w:rPr>
-              <w:instrText xml:space="preserve"> PAGEREF _Toc244112997 \h </w:instrText>
+              <w:instrText xml:space="preserve"> PAGEREF _Toc244165310 \h </w:instrText>
             </w:r>
             <w:r>
               <w:rPr>
@@ -2040,7 +2040,7 @@
               <w:szCs w:val="22"/>
             </w:rPr>
           </w:pPr>
-          <w:hyperlink w:anchor="_Toc244112998" w:history="1">
+          <w:hyperlink w:anchor="_Toc244165311" w:history="1">
             <w:r>
               <w:rPr>
                 <w:rStyle w:val="Hipervnculo"/>
@@ -2064,7 +2064,7 @@
               <w:rPr>
                 <w:noProof/>
               </w:rPr>
-              <w:instrText xml:space="preserve"> PAGEREF _Toc244112998 \h </w:instrText>
+              <w:instrText xml:space="preserve"> PAGEREF _Toc244165311 \h </w:instrText>
             </w:r>
             <w:r>
               <w:rPr>
@@ -2081,7 +2081,7 @@
               <w:rPr>
                 <w:noProof/>
               </w:rPr>
-              <w:t>19</w:t>
+              <w:t>20</w:t>
             </w:r>
             <w:r>
               <w:rPr>
@@ -2104,7 +2104,7 @@
               <w:szCs w:val="22"/>
             </w:rPr>
           </w:pPr>
-          <w:hyperlink w:anchor="_Toc244112999" w:history="1">
+          <w:hyperlink w:anchor="_Toc244165312" w:history="1">
             <w:r>
               <w:rPr>
                 <w:rStyle w:val="Hipervnculo"/>
@@ -2128,7 +2128,7 @@
               <w:rPr>
                 <w:noProof/>
               </w:rPr>
-              <w:instrText xml:space="preserve"> PAGEREF _Toc244112999 \h </w:instrText>
+              <w:instrText xml:space="preserve"> PAGEREF _Toc244165312 \h </w:instrText>
             </w:r>
             <w:r>
               <w:rPr>
@@ -2145,7 +2145,7 @@
               <w:rPr>
                 <w:noProof/>
               </w:rPr>
-              <w:t>21</w:t>
+              <w:t>22</w:t>
             </w:r>
             <w:r>
               <w:rPr>
@@ -2168,7 +2168,7 @@
               <w:szCs w:val="22"/>
             </w:rPr>
           </w:pPr>
-          <w:hyperlink w:anchor="_Toc244113000" w:history="1">
+          <w:hyperlink w:anchor="_Toc244165313" w:history="1">
             <w:r>
               <w:rPr>
                 <w:rStyle w:val="Hipervnculo"/>
@@ -2192,7 +2192,7 @@
               <w:rPr>
                 <w:noProof/>
               </w:rPr>
-              <w:instrText xml:space="preserve"> PAGEREF _Toc244113000 \h </w:instrText>
+              <w:instrText xml:space="preserve"> PAGEREF _Toc244165313 \h </w:instrText>
             </w:r>
             <w:r>
               <w:rPr>
@@ -2232,7 +2232,7 @@
               <w:szCs w:val="22"/>
             </w:rPr>
           </w:pPr>
-          <w:hyperlink w:anchor="_Toc244113001" w:history="1">
+          <w:hyperlink w:anchor="_Toc244165314" w:history="1">
             <w:r>
               <w:rPr>
                 <w:rStyle w:val="Hipervnculo"/>
@@ -2256,7 +2256,7 @@
               <w:rPr>
                 <w:noProof/>
               </w:rPr>
-              <w:instrText xml:space="preserve"> PAGEREF _Toc244113001 \h </w:instrText>
+              <w:instrText xml:space="preserve"> PAGEREF _Toc244165314 \h </w:instrText>
             </w:r>
             <w:r>
               <w:rPr>
@@ -2296,7 +2296,7 @@
               <w:szCs w:val="22"/>
             </w:rPr>
           </w:pPr>
-          <w:hyperlink w:anchor="_Toc244113002" w:history="1">
+          <w:hyperlink w:anchor="_Toc244165315" w:history="1">
             <w:r>
               <w:rPr>
                 <w:rStyle w:val="Hipervnculo"/>
@@ -2320,7 +2320,7 @@
               <w:rPr>
                 <w:noProof/>
               </w:rPr>
-              <w:instrText xml:space="preserve"> PAGEREF _Toc244113002 \h </w:instrText>
+              <w:instrText xml:space="preserve"> PAGEREF _Toc244165315 \h </w:instrText>
             </w:r>
             <w:r>
               <w:rPr>
@@ -2360,7 +2360,7 @@
               <w:szCs w:val="22"/>
             </w:rPr>
           </w:pPr>
-          <w:hyperlink w:anchor="_Toc244113003" w:history="1">
+          <w:hyperlink w:anchor="_Toc244165316" w:history="1">
             <w:r>
               <w:rPr>
                 <w:rStyle w:val="Hipervnculo"/>
@@ -2384,7 +2384,7 @@
               <w:rPr>
                 <w:noProof/>
               </w:rPr>
-              <w:instrText xml:space="preserve"> PAGEREF _Toc244113003 \h </w:instrText>
+              <w:instrText xml:space="preserve"> PAGEREF _Toc244165316 \h </w:instrText>
             </w:r>
             <w:r>
               <w:rPr>
@@ -2424,7 +2424,7 @@
               <w:szCs w:val="22"/>
             </w:rPr>
           </w:pPr>
-          <w:hyperlink w:anchor="_Toc244113004" w:history="1">
+          <w:hyperlink w:anchor="_Toc244165317" w:history="1">
             <w:r>
               <w:rPr>
                 <w:rStyle w:val="Hipervnculo"/>
@@ -2448,7 +2448,7 @@
               <w:rPr>
                 <w:noProof/>
               </w:rPr>
-              <w:instrText xml:space="preserve"> PAGEREF _Toc244113004 \h </w:instrText>
+              <w:instrText xml:space="preserve"> PAGEREF _Toc244165317 \h </w:instrText>
             </w:r>
             <w:r>
               <w:rPr>
@@ -2465,7 +2465,7 @@
               <w:rPr>
                 <w:noProof/>
               </w:rPr>
-              <w:t>24</w:t>
+              <w:t>25</w:t>
             </w:r>
             <w:r>
               <w:rPr>
@@ -2488,7 +2488,7 @@
               <w:szCs w:val="22"/>
             </w:rPr>
           </w:pPr>
-          <w:hyperlink w:anchor="_Toc244113005" w:history="1">
+          <w:hyperlink w:anchor="_Toc244165318" w:history="1">
             <w:r>
               <w:rPr>
                 <w:rStyle w:val="Hipervnculo"/>
@@ -2512,7 +2512,7 @@
               <w:rPr>
                 <w:noProof/>
               </w:rPr>
-              <w:instrText xml:space="preserve"> PAGEREF _Toc244113005 \h </w:instrText>
+              <w:instrText xml:space="preserve"> PAGEREF _Toc244165318 \h </w:instrText>
             </w:r>
             <w:r>
               <w:rPr>
@@ -2529,7 +2529,7 @@
               <w:rPr>
                 <w:noProof/>
               </w:rPr>
-              <w:t>25</w:t>
+              <w:t>26</w:t>
             </w:r>
             <w:r>
               <w:rPr>
@@ -2551,7 +2551,7 @@
         <w:pStyle w:val="Ttulo1"/>
         <w:pageBreakBefore/>
       </w:pPr>
-      <w:bookmarkStart w:id="0" w:name="_Toc244112970"/>
+      <w:bookmarkStart w:id="0" w:name="_Toc244165283"/>
       <w:r>
         <w:lastRenderedPageBreak/>
         <w:t>I. INTRODUCCIÓN</w:t>
@@ -2622,7 +2622,7 @@
       <w:pPr>
         <w:pStyle w:val="Ttulo1"/>
       </w:pPr>
-      <w:bookmarkStart w:id="1" w:name="_Toc244112971"/>
+      <w:bookmarkStart w:id="1" w:name="_Toc244165284"/>
       <w:r>
         <w:t>II. MARCO CONCEPTUAL</w:t>
       </w:r>
@@ -2632,7 +2632,7 @@
       <w:pPr>
         <w:pStyle w:val="Ttulo2"/>
       </w:pPr>
-      <w:bookmarkStart w:id="2" w:name="_Toc244112972"/>
+      <w:bookmarkStart w:id="2" w:name="_Toc244165285"/>
       <w:r>
         <w:t>2.1. Arquitectura monolítica</w:t>
       </w:r>
@@ -2676,7 +2676,7 @@
       <w:pPr>
         <w:pStyle w:val="Ttulo2"/>
       </w:pPr>
-      <w:bookmarkStart w:id="3" w:name="_Toc244112973"/>
+      <w:bookmarkStart w:id="3" w:name="_Toc244165286"/>
       <w:r>
         <w:t>2.2. Patrón Modelo-Vista-Controlador (MVC)</w:t>
       </w:r>
@@ -2793,7 +2793,7 @@
       <w:pPr>
         <w:pStyle w:val="Ttulo2"/>
       </w:pPr>
-      <w:bookmarkStart w:id="4" w:name="_Toc244112974"/>
+      <w:bookmarkStart w:id="4" w:name="_Toc244165287"/>
       <w:r>
         <w:lastRenderedPageBreak/>
         <w:t>2.3. Patrón DAO (Data Access Object)</w:t>
@@ -2892,7 +2892,7 @@
       <w:pPr>
         <w:pStyle w:val="Ttulo2"/>
       </w:pPr>
-      <w:bookmarkStart w:id="5" w:name="_Toc244112975"/>
+      <w:bookmarkStart w:id="5" w:name="_Toc244165288"/>
       <w:r>
         <w:t>2.4. .NET y ASP.NET Core</w:t>
       </w:r>
@@ -2943,7 +2943,7 @@
       <w:pPr>
         <w:pStyle w:val="Ttulo2"/>
       </w:pPr>
-      <w:bookmarkStart w:id="6" w:name="_Toc244112976"/>
+      <w:bookmarkStart w:id="6" w:name="_Toc244165289"/>
       <w:r>
         <w:t>2.5. Entity Framework Core y Database First</w:t>
       </w:r>
@@ -2993,7 +2993,7 @@
       <w:pPr>
         <w:pStyle w:val="Ttulo2"/>
       </w:pPr>
-      <w:bookmarkStart w:id="7" w:name="_Toc244112977"/>
+      <w:bookmarkStart w:id="7" w:name="_Toc244165290"/>
       <w:r>
         <w:lastRenderedPageBreak/>
         <w:t>2.6. Inyección de dependencias</w:t>
@@ -3105,7 +3105,7 @@
       <w:pPr>
         <w:pStyle w:val="Ttulo2"/>
       </w:pPr>
-      <w:bookmarkStart w:id="8" w:name="_Toc244112978"/>
+      <w:bookmarkStart w:id="8" w:name="_Toc244165291"/>
       <w:r>
         <w:t>2.7. Servicios REST</w:t>
       </w:r>
@@ -3227,7 +3227,7 @@
       <w:pPr>
         <w:pStyle w:val="Ttulo2"/>
       </w:pPr>
-      <w:bookmarkStart w:id="9" w:name="_Toc244112979"/>
+      <w:bookmarkStart w:id="9" w:name="_Toc244165292"/>
       <w:r>
         <w:t>2.8. OpenAPI y Swagger</w:t>
       </w:r>
@@ -3247,7 +3247,7 @@
       <w:pPr>
         <w:pStyle w:val="Ttulo2"/>
       </w:pPr>
-      <w:bookmarkStart w:id="10" w:name="_Toc244112980"/>
+      <w:bookmarkStart w:id="10" w:name="_Toc244165293"/>
       <w:r>
         <w:t>2.9. SQL Server</w:t>
       </w:r>
@@ -3287,7 +3287,7 @@
       <w:pPr>
         <w:pStyle w:val="Ttulo2"/>
       </w:pPr>
-      <w:bookmarkStart w:id="11" w:name="_Toc244112981"/>
+      <w:bookmarkStart w:id="11" w:name="_Toc244165294"/>
       <w:r>
         <w:t>2.10. Control de versiones con Git</w:t>
       </w:r>
@@ -3327,7 +3327,7 @@
       <w:pPr>
         <w:pStyle w:val="Ttulo1"/>
       </w:pPr>
-      <w:bookmarkStart w:id="12" w:name="_Toc244112982"/>
+      <w:bookmarkStart w:id="12" w:name="_Toc244165295"/>
       <w:r>
         <w:t>III. DISEÑO</w:t>
       </w:r>
@@ -3337,7 +3337,7 @@
       <w:pPr>
         <w:pStyle w:val="Ttulo2"/>
       </w:pPr>
-      <w:bookmarkStart w:id="13" w:name="_Toc244112983"/>
+      <w:bookmarkStart w:id="13" w:name="_Toc244165296"/>
       <w:r>
         <w:t>3.1. Requerimientos</w:t>
       </w:r>
@@ -3415,7 +3415,7 @@
       <w:pPr>
         <w:pStyle w:val="Ttulo2"/>
       </w:pPr>
-      <w:bookmarkStart w:id="14" w:name="_Toc244112984"/>
+      <w:bookmarkStart w:id="14" w:name="_Toc244165297"/>
       <w:r>
         <w:t>3.2. Vista de arquitectura</w:t>
       </w:r>
@@ -3528,7 +3528,7 @@
       <w:pPr>
         <w:pStyle w:val="Ttulo2"/>
       </w:pPr>
-      <w:bookmarkStart w:id="15" w:name="_Toc244112985"/>
+      <w:bookmarkStart w:id="15" w:name="_Toc244165298"/>
       <w:r>
         <w:t>3.3. Modelo de datos</w:t>
       </w:r>
@@ -4272,7 +4272,7 @@
       <w:pPr>
         <w:pStyle w:val="Ttulo2"/>
       </w:pPr>
-      <w:bookmarkStart w:id="16" w:name="_Toc244112986"/>
+      <w:bookmarkStart w:id="16" w:name="_Toc244165299"/>
       <w:r>
         <w:t>3.4. Diseño del DAO</w:t>
       </w:r>
@@ -4502,7 +4502,7 @@
       <w:pPr>
         <w:pStyle w:val="Ttulo2"/>
       </w:pPr>
-      <w:bookmarkStart w:id="17" w:name="_Toc244112987"/>
+      <w:bookmarkStart w:id="17" w:name="_Toc244165300"/>
       <w:r>
         <w:lastRenderedPageBreak/>
         <w:t>3.5. Diseño de la API REST</w:t>
@@ -5751,7 +5751,7 @@
       <w:pPr>
         <w:pStyle w:val="Ttulo2"/>
       </w:pPr>
-      <w:bookmarkStart w:id="18" w:name="_Toc244112988"/>
+      <w:bookmarkStart w:id="18" w:name="_Toc244165301"/>
       <w:r>
         <w:t>3.6. Diseño de la interfaz MVC</w:t>
       </w:r>
@@ -5837,7 +5837,7 @@
       <w:pPr>
         <w:pStyle w:val="Ttulo2"/>
       </w:pPr>
-      <w:bookmarkStart w:id="19" w:name="_Toc244112989"/>
+      <w:bookmarkStart w:id="19" w:name="_Toc244165302"/>
       <w:r>
         <w:t>3.7. Estructura del proyecto</w:t>
       </w:r>
@@ -6594,7 +6594,7 @@
       <w:pPr>
         <w:pStyle w:val="Ttulo2"/>
       </w:pPr>
-      <w:bookmarkStart w:id="20" w:name="_Toc244112990"/>
+      <w:bookmarkStart w:id="20" w:name="_Toc244165303"/>
       <w:r>
         <w:lastRenderedPageBreak/>
         <w:t>3.8. Decisiones de diseño</w:t>
@@ -7398,7 +7398,7 @@
       <w:pPr>
         <w:pStyle w:val="Ttulo1"/>
       </w:pPr>
-      <w:bookmarkStart w:id="21" w:name="_Toc244112991"/>
+      <w:bookmarkStart w:id="21" w:name="_Toc244165304"/>
       <w:r>
         <w:t>IV. PROCEDIMIENTO</w:t>
       </w:r>
@@ -7418,7 +7418,7 @@
       <w:pPr>
         <w:pStyle w:val="Ttulo2"/>
       </w:pPr>
-      <w:bookmarkStart w:id="22" w:name="_Toc244112992"/>
+      <w:bookmarkStart w:id="22" w:name="_Toc244165305"/>
       <w:r>
         <w:t>4.1. Herramientas y versiones</w:t>
       </w:r>
@@ -8222,7 +8222,7 @@
       <w:pPr>
         <w:pStyle w:val="Ttulo2"/>
       </w:pPr>
-      <w:bookmarkStart w:id="23" w:name="_Toc244112993"/>
+      <w:bookmarkStart w:id="23" w:name="_Toc244165306"/>
       <w:r>
         <w:t>4.2. Instalación del ambiente</w:t>
       </w:r>
@@ -8287,7 +8287,7 @@
         <w:jc w:val="both"/>
       </w:pPr>
       <w:r>
-        <w:t xml:space="preserve">Se instala Visual Studio 2022 con las cargas de trabajo </w:t>
+        <w:t xml:space="preserve">Se instala Visual Studio Community 2022 con las cuatro cargas de trabajo del procedimiento: </w:t>
       </w:r>
       <w:r>
         <w:rPr>
@@ -8297,7 +8297,7 @@
         <w:t>Desarrollo de ASP.NET y web</w:t>
       </w:r>
       <w:r>
-        <w:t xml:space="preserve"> y </w:t>
+        <w:t xml:space="preserve">, </w:t>
       </w:r>
       <w:r>
         <w:rPr>
@@ -8307,7 +8307,27 @@
         <w:t>Almacenamiento y procesamiento de datos</w:t>
       </w:r>
       <w:r>
-        <w:t>, más el SDK de .NET 7 como componente individual.</w:t>
+        <w:t xml:space="preserve">, </w:t>
+      </w:r>
+      <w:r>
+        <w:rPr>
+          <w:i/>
+          <w:iCs/>
+        </w:rPr>
+        <w:t>Plantillas de proyecto y elementos de .NET Framework</w:t>
+      </w:r>
+      <w:r>
+        <w:t xml:space="preserve"> y </w:t>
+      </w:r>
+      <w:r>
+        <w:rPr>
+          <w:i/>
+          <w:iCs/>
+        </w:rPr>
+        <w:t>Características avanzadas de ASP.NET</w:t>
+      </w:r>
+      <w:r>
+        <w:t>. La versión 17.14 ya no incluye .NET 7, por lo que el SDK 7.0.410 se instala aparte con su instalador oficial; Visual Studio lo detecta porque queda en C:\Program Files\dotnet.</w:t>
       </w:r>
     </w:p>
     <w:p>
@@ -8328,7 +8348,7 @@
       <w:pPr>
         <w:pStyle w:val="Ttulo2"/>
       </w:pPr>
-      <w:bookmarkStart w:id="24" w:name="_Toc244112994"/>
+      <w:bookmarkStart w:id="24" w:name="_Toc244165307"/>
       <w:r>
         <w:t>4.3. Creación de la base de datos</w:t>
       </w:r>
@@ -8445,6 +8465,7 @@
           <w:sz w:val="17"/>
           <w:szCs w:val="17"/>
         </w:rPr>
+        <w:lastRenderedPageBreak/>
         <w:t xml:space="preserve">    CONSTRAINT PK_estudios PRIMARY KEY (id_prof, cc_per),</w:t>
       </w:r>
     </w:p>
@@ -8508,7 +8529,6 @@
         <w:jc w:val="both"/>
       </w:pPr>
       <w:r>
-        <w:lastRenderedPageBreak/>
         <w:t>El DML inserta 4 personas, 4 profesiones, 5 estudios y 5 teléfonos, y la carga se verifica con un SELECT COUNT(*) por tabla. Los scripts usan IF OBJECT_ID(...) IS NULL, así que se pueden ejecutar varias veces sin error.</w:t>
       </w:r>
     </w:p>
@@ -8516,7 +8536,7 @@
       <w:pPr>
         <w:pStyle w:val="Ttulo2"/>
       </w:pPr>
-      <w:bookmarkStart w:id="25" w:name="_Toc244112995"/>
+      <w:bookmarkStart w:id="25" w:name="_Toc244165308"/>
       <w:r>
         <w:t>4.4. Creación del proyecto en Visual Studio</w:t>
       </w:r>
@@ -8533,7 +8553,7 @@
         <w:jc w:val="both"/>
       </w:pPr>
       <w:r>
-        <w:t>Se crea un proyecto con la plantilla Aplicación web de ASP.NET Core (Modelo-Vista-Controlador), nombre personapi-dotnet, marco .NET 7.0 y sin autenticación.</w:t>
+        <w:t>Se crea un proyecto con la plantilla Aplicación web de ASP.NET Core (Modelo-Vista-Controlador), nombre personapi-dotnet, marco .NET 7.0, sin autenticación y sin configuración HTTPS.</w:t>
       </w:r>
     </w:p>
     <w:p>
@@ -8568,7 +8588,7 @@
       <w:pPr>
         <w:pStyle w:val="Ttulo2"/>
       </w:pPr>
-      <w:bookmarkStart w:id="26" w:name="_Toc244112996"/>
+      <w:bookmarkStart w:id="26" w:name="_Toc244165309"/>
       <w:r>
         <w:t>4.5. Generación de las entidades (Database First)</w:t>
       </w:r>
@@ -8639,6 +8659,7 @@
         <w:jc w:val="both"/>
       </w:pPr>
       <w:r>
+        <w:lastRenderedPageBreak/>
         <w:t>Se registra el contexto en Program.cs con AddDbContext&lt;PersonaDbContext&gt;(o =&gt; o.UseSqlServer(...)), la misma configuración que usa Guamán (2022a) en un proyecto Code First.</w:t>
       </w:r>
     </w:p>
@@ -8653,7 +8674,6 @@
         <w:jc w:val="both"/>
       </w:pPr>
       <w:r>
-        <w:lastRenderedPageBreak/>
         <w:t>Se añaden anotaciones de validación a las entidades ([Required], [StringLength], [Range], [Display]) para los formularios.</w:t>
       </w:r>
     </w:p>
@@ -8671,7 +8691,7 @@
       <w:pPr>
         <w:pStyle w:val="Ttulo2"/>
       </w:pPr>
-      <w:bookmarkStart w:id="27" w:name="_Toc244112997"/>
+      <w:bookmarkStart w:id="27" w:name="_Toc244165310"/>
       <w:r>
         <w:t>4.6. Implementación del DAO</w:t>
       </w:r>
@@ -9008,8 +9028,9 @@
       <w:pPr>
         <w:pStyle w:val="Ttulo2"/>
       </w:pPr>
-      <w:bookmarkStart w:id="28" w:name="_Toc244112998"/>
-      <w:r>
+      <w:bookmarkStart w:id="28" w:name="_Toc244165311"/>
+      <w:r>
+        <w:lastRenderedPageBreak/>
         <w:t>4.7. Controladores y vistas MVC</w:t>
       </w:r>
       <w:bookmarkEnd w:id="28"/>
@@ -9034,7 +9055,6 @@
         <w:rPr>
           <w:noProof/>
         </w:rPr>
-        <w:lastRenderedPageBreak/>
         <w:drawing>
           <wp:inline distT="0" distB="0" distL="0" distR="0" wp14:anchorId="32729BFD" wp14:editId="71D71239">
             <wp:extent cx="5029200" cy="3143250"/>
@@ -9111,6 +9131,7 @@
         <w:rPr>
           <w:noProof/>
         </w:rPr>
+        <w:lastRenderedPageBreak/>
         <w:drawing>
           <wp:inline distT="0" distB="0" distL="0" distR="0" wp14:anchorId="62E30253" wp14:editId="39DD2077">
             <wp:extent cx="5029200" cy="3143250"/>
@@ -9197,7 +9218,6 @@
         <w:rPr>
           <w:noProof/>
         </w:rPr>
-        <w:lastRenderedPageBreak/>
         <w:drawing>
           <wp:inline distT="0" distB="0" distL="0" distR="0" wp14:anchorId="733347CC" wp14:editId="115663C2">
             <wp:extent cx="5029200" cy="3143250"/>
@@ -9268,8 +9288,9 @@
       <w:pPr>
         <w:pStyle w:val="Ttulo2"/>
       </w:pPr>
-      <w:bookmarkStart w:id="29" w:name="_Toc244112999"/>
-      <w:r>
+      <w:bookmarkStart w:id="29" w:name="_Toc244165312"/>
+      <w:r>
+        <w:lastRenderedPageBreak/>
         <w:t>4.8. API REST y Swagger</w:t>
       </w:r>
       <w:bookmarkEnd w:id="29"/>
@@ -9294,7 +9315,6 @@
         <w:rPr>
           <w:noProof/>
         </w:rPr>
-        <w:lastRenderedPageBreak/>
         <w:drawing>
           <wp:inline distT="0" distB="0" distL="0" distR="0" wp14:anchorId="3A3DCCB0" wp14:editId="6FE25327">
             <wp:extent cx="5029200" cy="3143250"/>
@@ -9365,7 +9385,7 @@
       <w:pPr>
         <w:pStyle w:val="Ttulo2"/>
       </w:pPr>
-      <w:bookmarkStart w:id="30" w:name="_Toc244113000"/>
+      <w:bookmarkStart w:id="30" w:name="_Toc244165313"/>
       <w:r>
         <w:t>4.9. Pruebas</w:t>
       </w:r>
@@ -9396,6 +9416,7 @@
           <w:b/>
           <w:bCs/>
         </w:rPr>
+        <w:lastRenderedPageBreak/>
         <w:t>Compilación por commit:</w:t>
       </w:r>
       <w:r>
@@ -9477,7 +9498,6 @@
           <w:b/>
           <w:bCs/>
         </w:rPr>
-        <w:lastRenderedPageBreak/>
         <w:t>Vistas MVC:</w:t>
       </w:r>
       <w:r>
@@ -9519,7 +9539,7 @@
       <w:pPr>
         <w:pStyle w:val="Ttulo2"/>
       </w:pPr>
-      <w:bookmarkStart w:id="31" w:name="_Toc244113001"/>
+      <w:bookmarkStart w:id="31" w:name="_Toc244165314"/>
       <w:r>
         <w:t>4.10. Compilación y despliegue</w:t>
       </w:r>
@@ -9645,6 +9665,7 @@
         <w:jc w:val="both"/>
       </w:pPr>
       <w:r>
+        <w:lastRenderedPageBreak/>
         <w:t xml:space="preserve">La versión publicada arranca con Kestrel y responde en la página de inicio, en /api/personas y en el documento de Swagger. El servidor de destino solo necesita el runtime de ASP.NET Core 7 y acceso a la base. También se puede alojar en IIS con el </w:t>
       </w:r>
       <w:r>
@@ -9662,9 +9683,8 @@
       <w:pPr>
         <w:pStyle w:val="Ttulo1"/>
       </w:pPr>
-      <w:bookmarkStart w:id="32" w:name="_Toc244113002"/>
-      <w:r>
-        <w:lastRenderedPageBreak/>
+      <w:bookmarkStart w:id="32" w:name="_Toc244165315"/>
+      <w:r>
         <w:t>V. CONCLUSIONES Y LECCIONES APRENDIDAS</w:t>
       </w:r>
       <w:bookmarkEnd w:id="32"/>
@@ -9673,7 +9693,7 @@
       <w:pPr>
         <w:pStyle w:val="Ttulo2"/>
       </w:pPr>
-      <w:bookmarkStart w:id="33" w:name="_Toc244113003"/>
+      <w:bookmarkStart w:id="33" w:name="_Toc244165316"/>
       <w:r>
         <w:t>5.1. Conclusiones</w:t>
       </w:r>
@@ -9752,6 +9772,7 @@
         <w:jc w:val="both"/>
       </w:pPr>
       <w:r>
+        <w:lastRenderedPageBreak/>
         <w:t>Swagger convierte la documentación de la API en un subproducto del código: la especificación OpenAPI se genera sola y sirve a la vez como documentación y como herramienta de prueba.</w:t>
       </w:r>
     </w:p>
@@ -9759,7 +9780,7 @@
       <w:pPr>
         <w:pStyle w:val="Ttulo2"/>
       </w:pPr>
-      <w:bookmarkStart w:id="34" w:name="_Toc244113004"/>
+      <w:bookmarkStart w:id="34" w:name="_Toc244165317"/>
       <w:r>
         <w:t>5.2. Lecciones aprendidas</w:t>
       </w:r>
@@ -9790,7 +9811,6 @@
         <w:jc w:val="both"/>
       </w:pPr>
       <w:r>
-        <w:lastRenderedPageBreak/>
         <w:t>El certificado de SQL Server no es un detalle. Desde EF Core 7 la conexión va cifrada por defecto; sin TrustServerCertificate=true la aplicación no se conecta a una instancia local. Entender el error ahorra tiempo frente a cambiar configuraciones al azar.</w:t>
       </w:r>
     </w:p>
@@ -9854,8 +9874,9 @@
       <w:pPr>
         <w:pStyle w:val="Ttulo1"/>
       </w:pPr>
-      <w:bookmarkStart w:id="35" w:name="_Toc244113005"/>
-      <w:r>
+      <w:bookmarkStart w:id="35" w:name="_Toc244165318"/>
+      <w:r>
+        <w:lastRenderedPageBreak/>
         <w:t>VI. REFERENCIAS</w:t>
       </w:r>
       <w:bookmarkEnd w:id="35"/>
@@ -9942,7 +9963,6 @@
         <w:ind w:left="720" w:hanging="720"/>
       </w:pPr>
       <w:r>
-        <w:lastRenderedPageBreak/>
         <w:t xml:space="preserve">Fielding, R. T. (2000). </w:t>
       </w:r>
       <w:r>
@@ -10095,6 +10115,7 @@
         <w:ind w:left="720" w:hanging="720"/>
       </w:pPr>
       <w:r>
+        <w:lastRenderedPageBreak/>
         <w:t xml:space="preserve">Microsoft. (s.f.-a). </w:t>
       </w:r>
       <w:r>
@@ -10171,7 +10192,6 @@
         <w:ind w:left="720" w:hanging="720"/>
       </w:pPr>
       <w:r>
-        <w:lastRenderedPageBreak/>
         <w:t xml:space="preserve">Microsoft. (s.f.-e). </w:t>
       </w:r>
       <w:r>

</xml_diff>